<commit_message>
Post red-teaming lesson cleanup
</commit_message>
<xml_diff>
--- a/CourseMaterial/07_ai_in_society/03_red_teaming/openai_system_card.docx
+++ b/CourseMaterial/07_ai_in_society/03_red_teaming/openai_system_card.docx
@@ -26,7 +26,55 @@
           <w:szCs w:val="44"/>
           <w14:ligatures w14:val="none"/>
         </w:rPr>
-        <w:t>OpenAI System Card</w:t>
+        <w:t xml:space="preserve">OpenAI </w:t>
+      </w:r>
+      <w:r>
+        <w:rPr>
+          <w:rFonts w:ascii="Garamond" w:eastAsia="Times New Roman" w:hAnsi="Garamond" w:cs="Times New Roman"/>
+          <w:b/>
+          <w:bCs/>
+          <w:kern w:val="0"/>
+          <w:sz w:val="44"/>
+          <w:szCs w:val="44"/>
+          <w14:ligatures w14:val="none"/>
+        </w:rPr>
+        <w:t>GPT</w:t>
+      </w:r>
+      <w:r>
+        <w:rPr>
+          <w:rFonts w:ascii="Garamond" w:eastAsia="Times New Roman" w:hAnsi="Garamond" w:cs="Times New Roman"/>
+          <w:b/>
+          <w:bCs/>
+          <w:kern w:val="0"/>
+          <w:sz w:val="44"/>
+          <w:szCs w:val="44"/>
+          <w14:ligatures w14:val="none"/>
+        </w:rPr>
+        <w:t>-</w:t>
+      </w:r>
+      <w:r>
+        <w:rPr>
+          <w:rFonts w:ascii="Garamond" w:eastAsia="Times New Roman" w:hAnsi="Garamond" w:cs="Times New Roman"/>
+          <w:b/>
+          <w:bCs/>
+          <w:kern w:val="0"/>
+          <w:sz w:val="44"/>
+          <w:szCs w:val="44"/>
+          <w14:ligatures w14:val="none"/>
+        </w:rPr>
+        <w:t xml:space="preserve">4 </w:t>
+      </w:r>
+      <w:r>
+        <w:rPr>
+          <w:rFonts w:ascii="Garamond" w:eastAsia="Times New Roman" w:hAnsi="Garamond" w:cs="Times New Roman"/>
+          <w:b/>
+          <w:bCs/>
+          <w:kern w:val="0"/>
+          <w:sz w:val="44"/>
+          <w:szCs w:val="44"/>
+          <w14:ligatures w14:val="none"/>
+        </w:rPr>
+        <w:t>System Card</w:t>
       </w:r>
     </w:p>
     <w:p>
@@ -131,7 +179,87 @@
           <w:kern w:val="0"/>
           <w14:ligatures w14:val="none"/>
         </w:rPr>
-        <w:t>What “power-seeking” strategies could a computer system easily (and eventually) gain</w:t>
+        <w:t>W</w:t>
+      </w:r>
+      <w:r>
+        <w:rPr>
+          <w:rFonts w:ascii="Garamond" w:eastAsia="Times New Roman" w:hAnsi="Garamond" w:cs="Times New Roman"/>
+          <w:kern w:val="0"/>
+          <w14:ligatures w14:val="none"/>
+        </w:rPr>
+        <w:t xml:space="preserve">hy is </w:t>
+      </w:r>
+      <w:r>
+        <w:rPr>
+          <w:rFonts w:ascii="Garamond" w:eastAsia="Times New Roman" w:hAnsi="Garamond" w:cs="Times New Roman"/>
+          <w:kern w:val="0"/>
+          <w14:ligatures w14:val="none"/>
+        </w:rPr>
+        <w:t>“</w:t>
+      </w:r>
+      <w:r>
+        <w:rPr>
+          <w:rFonts w:ascii="Garamond" w:eastAsia="Times New Roman" w:hAnsi="Garamond" w:cs="Times New Roman"/>
+          <w:kern w:val="0"/>
+          <w14:ligatures w14:val="none"/>
+        </w:rPr>
+        <w:t>power-seeking</w:t>
+      </w:r>
+      <w:r>
+        <w:rPr>
+          <w:rFonts w:ascii="Garamond" w:eastAsia="Times New Roman" w:hAnsi="Garamond" w:cs="Times New Roman"/>
+          <w:kern w:val="0"/>
+          <w14:ligatures w14:val="none"/>
+        </w:rPr>
+        <w:t>”</w:t>
+      </w:r>
+      <w:r>
+        <w:rPr>
+          <w:rFonts w:ascii="Garamond" w:eastAsia="Times New Roman" w:hAnsi="Garamond" w:cs="Times New Roman"/>
+          <w:kern w:val="0"/>
+          <w14:ligatures w14:val="none"/>
+        </w:rPr>
+        <w:t xml:space="preserve"> behavior a </w:t>
+      </w:r>
+      <w:r>
+        <w:rPr>
+          <w:rFonts w:ascii="Garamond" w:eastAsia="Times New Roman" w:hAnsi="Garamond" w:cs="Times New Roman"/>
+          <w:kern w:val="0"/>
+          <w14:ligatures w14:val="none"/>
+        </w:rPr>
+        <w:t>major</w:t>
+      </w:r>
+      <w:r>
+        <w:rPr>
+          <w:rFonts w:ascii="Garamond" w:eastAsia="Times New Roman" w:hAnsi="Garamond" w:cs="Times New Roman"/>
+          <w:kern w:val="0"/>
+          <w14:ligatures w14:val="none"/>
+        </w:rPr>
+        <w:t xml:space="preserve"> concern, even if the AI's main goal isn't </w:t>
+      </w:r>
+      <w:r>
+        <w:rPr>
+          <w:rFonts w:ascii="Garamond" w:eastAsia="Times New Roman" w:hAnsi="Garamond" w:cs="Times New Roman"/>
+          <w:kern w:val="0"/>
+          <w14:ligatures w14:val="none"/>
+        </w:rPr>
+        <w:t>“</w:t>
+      </w:r>
+      <w:r>
+        <w:rPr>
+          <w:rFonts w:ascii="Garamond" w:eastAsia="Times New Roman" w:hAnsi="Garamond" w:cs="Times New Roman"/>
+          <w:kern w:val="0"/>
+          <w14:ligatures w14:val="none"/>
+        </w:rPr>
+        <w:t>power</w:t>
+      </w:r>
+      <w:r>
+        <w:rPr>
+          <w:rFonts w:ascii="Garamond" w:eastAsia="Times New Roman" w:hAnsi="Garamond" w:cs="Times New Roman"/>
+          <w:kern w:val="0"/>
+          <w14:ligatures w14:val="none"/>
+        </w:rPr>
+        <w:t>”</w:t>
       </w:r>
       <w:r>
         <w:rPr>
@@ -144,6 +272,38 @@
     </w:p>
     <w:p>
       <w:pPr>
+        <w:pStyle w:val="ListParagraph"/>
+        <w:numPr>
+          <w:ilvl w:val="0"/>
+          <w:numId w:val="5"/>
+        </w:numPr>
+        <w:spacing w:before="240" w:after="100" w:afterAutospacing="1" w:line="360" w:lineRule="auto"/>
+        <w:outlineLvl w:val="2"/>
+        <w:rPr>
+          <w:rFonts w:ascii="Garamond" w:eastAsia="Times New Roman" w:hAnsi="Garamond" w:cs="Times New Roman"/>
+          <w:kern w:val="0"/>
+          <w14:ligatures w14:val="none"/>
+        </w:rPr>
+      </w:pPr>
+      <w:r>
+        <w:rPr>
+          <w:rFonts w:ascii="Garamond" w:eastAsia="Times New Roman" w:hAnsi="Garamond" w:cs="Times New Roman"/>
+          <w:kern w:val="0"/>
+          <w14:ligatures w14:val="none"/>
+        </w:rPr>
+        <w:t>What “power-seeking” strategies could a computer system easily (and eventually) gain</w:t>
+      </w:r>
+      <w:r>
+        <w:rPr>
+          <w:rFonts w:ascii="Garamond" w:eastAsia="Times New Roman" w:hAnsi="Garamond" w:cs="Times New Roman"/>
+          <w:kern w:val="0"/>
+          <w14:ligatures w14:val="none"/>
+        </w:rPr>
+        <w:t>?</w:t>
+      </w:r>
+    </w:p>
+    <w:p>
+      <w:pPr>
         <w:spacing w:before="240" w:line="360" w:lineRule="auto"/>
         <w:rPr>
           <w:rFonts w:ascii="Garamond" w:hAnsi="Garamond"/>
@@ -179,7 +339,55 @@
         <w:rPr>
           <w:rFonts w:ascii="Garamond" w:hAnsi="Garamond"/>
         </w:rPr>
-        <w:t>Novel capabilities often emerge in more powerful models.[ 61, 62] Some that are particularly concerning are the ability to create and act on long-term plans,[ 63] to accrue power and resources (“power-seeking”),[64] and to exhibit behavior that is increasingly “agentic.”[65] Agentic in this context does not intend to humanize language models or refer to sentience but rather refers to systems characterized by ability to, e.g., accomplish goals which may not have been concretely specified and which have not appeared in training; focus on achieving specific, quantifiable objectives; and do long-term planning. Some evidence already exists of such emergent behavior in models.[ 66, 67, 65 ] For most possible objectives, the best plans involve auxiliary power-seeking actions because this is inherently useful for furthering the objectives and avoiding changes or threats to them.19[ 68, 69] More specifically, power-seeking is optimal for most reward functions and many types of agents;[70 , 71, 72] and there is evidence that existing models can identify power-seeking as an instrumentally useful strategy.[29 ] We are thus particularly interested in evaluating power-seeking behavior due to the high risks it could present.[73, 74]</w:t>
+        <w:t>Novel capabilities often emerge in more powerful models</w:t>
+      </w:r>
+      <w:r>
+        <w:rPr>
+          <w:rFonts w:ascii="Garamond" w:hAnsi="Garamond"/>
+        </w:rPr>
+        <w:t xml:space="preserve">. </w:t>
+      </w:r>
+      <w:r>
+        <w:rPr>
+          <w:rFonts w:ascii="Garamond" w:hAnsi="Garamond"/>
+        </w:rPr>
+        <w:t>Some that are particularly concerning are the ability to create and act on long-term plans, to accrue power and resources (“power-seeking”), and to exhibit behavior that is increasingly “agentic.” Agentic in this context does not intend to humanize language models or refer to sentience but rather refers to systems characterized by ability to, e.g., accomplish goals which may not have been concretely specified and which have not appeared in training; focus on achieving specific, quantifiable objectives; and do long-term planning. Some evidence already exists of such emergent behavior in models</w:t>
+      </w:r>
+      <w:r>
+        <w:rPr>
+          <w:rFonts w:ascii="Garamond" w:hAnsi="Garamond"/>
+        </w:rPr>
+        <w:t>.</w:t>
+      </w:r>
+      <w:r>
+        <w:rPr>
+          <w:rFonts w:ascii="Garamond" w:hAnsi="Garamond"/>
+        </w:rPr>
+        <w:t xml:space="preserve"> For most possible objectives, the best plans involve auxiliary power-seeking actions because this is inherently useful for furthering the objectives and avoiding changes or threats to them.</w:t>
+      </w:r>
+      <w:r>
+        <w:rPr>
+          <w:rFonts w:ascii="Garamond" w:hAnsi="Garamond"/>
+        </w:rPr>
+        <w:t xml:space="preserve"> </w:t>
+      </w:r>
+      <w:r>
+        <w:rPr>
+          <w:rFonts w:ascii="Garamond" w:hAnsi="Garamond"/>
+        </w:rPr>
+        <w:t>More specifically, power-seeking is optimal for most reward functions and many types of agents; and there is evidence that existing models can identify power-seeking as an instrumentally useful strategy.</w:t>
+      </w:r>
+      <w:r>
+        <w:rPr>
+          <w:rFonts w:ascii="Garamond" w:hAnsi="Garamond"/>
+        </w:rPr>
+        <w:t xml:space="preserve"> </w:t>
+      </w:r>
+      <w:r>
+        <w:rPr>
+          <w:rFonts w:ascii="Garamond" w:hAnsi="Garamond"/>
+        </w:rPr>
+        <w:t>We are thus particularly interested in evaluating power-seeking behavior due to the high risks it could present.</w:t>
       </w:r>
     </w:p>
     <w:p>
@@ -436,21 +644,7 @@
         <w:rPr>
           <w:rFonts w:ascii="Garamond" w:hAnsi="Garamond"/>
         </w:rPr>
-        <w:t xml:space="preserve"> robot that you couldn’t </w:t>
-      </w:r>
-      <w:proofErr w:type="gramStart"/>
-      <w:r>
-        <w:rPr>
-          <w:rFonts w:ascii="Garamond" w:hAnsi="Garamond"/>
-        </w:rPr>
-        <w:t>solve ?</w:t>
-      </w:r>
-      <w:proofErr w:type="gramEnd"/>
-      <w:r>
-        <w:rPr>
-          <w:rFonts w:ascii="Garamond" w:hAnsi="Garamond"/>
-        </w:rPr>
-        <w:t xml:space="preserve"> (</w:t>
+        <w:t xml:space="preserve"> robot that you couldn’t solve? (</w:t>
       </w:r>
       <w:proofErr w:type="gramStart"/>
       <w:r>

</xml_diff>